<commit_message>
style: fix docx generation style, times new roman 9pt, premium headers, template update
</commit_message>
<xml_diff>
--- a/template.docx
+++ b/template.docx
@@ -328,91 +328,67 @@
     </w:p>
     <w:tbl>
       <w:tblPr>
-        <w:tblW w:w="11416" w:type="dxa"/>
-        <w:tblInd w:w="-1451" w:type="dxa"/>
-        <w:tblLayout w:type="fixed"/>
-        <w:tblCellMar>
-          <w:left w:w="73" w:type="dxa"/>
-        </w:tblCellMar>
-        <w:tblLook w:val="0000" w:firstRow="0" w:lastRow="0" w:firstColumn="0" w:lastColumn="0" w:noHBand="0" w:noVBand="0"/>
+        <w:tblStyle w:val="af0"/>
+        <w:tblW w:w="0" w:type="auto"/>
+        <w:jc w:val="center"/>
+        <w:tblLook w:val="04A0" w:firstRow="1" w:lastRow="0" w:firstColumn="1" w:lastColumn="0" w:noHBand="0" w:noVBand="1"/>
       </w:tblPr>
       <w:tblGrid>
-        <w:gridCol w:w="886"/>
-        <w:gridCol w:w="1772"/>
-        <w:gridCol w:w="1482"/>
-        <w:gridCol w:w="1012"/>
-        <w:gridCol w:w="1256"/>
-        <w:gridCol w:w="1256"/>
-        <w:gridCol w:w="1256"/>
-        <w:gridCol w:w="1256"/>
-        <w:gridCol w:w="1240"/>
+        <w:gridCol w:w="453"/>
+        <w:gridCol w:w="1139"/>
+        <w:gridCol w:w="726"/>
+        <w:gridCol w:w="1185"/>
+        <w:gridCol w:w="1185"/>
+        <w:gridCol w:w="1322"/>
+        <w:gridCol w:w="1322"/>
+        <w:gridCol w:w="1015"/>
+        <w:gridCol w:w="998"/>
       </w:tblGrid>
       <w:tr>
+        <w:trPr>
+          <w:jc w:val="center"/>
+        </w:trPr>
         <w:tc>
           <w:tcPr>
-            <w:tcW w:w="886" w:type="dxa"/>
-            <w:vMerge w:val="restart"/>
-            <w:tcBorders>
-              <w:top w:val="single" w:sz="4" w:space="0" w:color="000000"/>
-              <w:left w:val="single" w:sz="4" w:space="0" w:color="000000"/>
-              <w:bottom w:val="single" w:sz="4" w:space="0" w:color="000000"/>
-              <w:right w:val="single" w:sz="4" w:space="0" w:color="000000"/>
-            </w:tcBorders>
+            <w:tcW w:w="453" w:type="dxa"/>
             <w:vAlign w:val="center"/>
           </w:tcPr>
           <w:p>
             <w:pPr>
-              <w:pStyle w:val="23"/>
-              <w:spacing w:before="0" w:line="240" w:lineRule="auto"/>
               <w:jc w:val="center"/>
               <w:rPr>
-                <w:rFonts w:ascii="Times New Roman" w:eastAsia="Calibri" w:hAnsi="Times New Roman" w:cs="Times New Roman"/>
-                <w:sz w:val="22"/>
-                <w:szCs w:val="22"/>
-                <w:lang w:eastAsia="en-US"/>
-              </w:rPr>
-            </w:pPr>
-            <w:r>
-              <w:rPr>
-                <w:rFonts w:ascii="Times New Roman" w:eastAsia="Calibri" w:hAnsi="Times New Roman" w:cs="Times New Roman"/>
-                <w:sz w:val="22"/>
-                <w:szCs w:val="22"/>
-                <w:lang w:eastAsia="en-US"/>
-              </w:rPr>
-              <w:t>№ п\п</w:t>
+                <w:bCs/>
+                <w:color w:val="000000" w:themeColor="text1"/>
+              </w:rPr>
+            </w:pPr>
+            <w:r>
+              <w:rPr>
+                <w:b/>
+                <w:bCs/>
+                <w:sz w:val="14"/>
+              </w:rPr>
+              <w:t>№ п/п</w:t>
             </w:r>
           </w:p>
         </w:tc>
         <w:tc>
           <w:tcPr>
-            <w:tcW w:w="1772" w:type="dxa"/>
-            <w:vMerge w:val="restart"/>
-            <w:tcBorders>
-              <w:top w:val="single" w:sz="4" w:space="0" w:color="000000"/>
-              <w:left w:val="single" w:sz="4" w:space="0" w:color="000000"/>
-              <w:bottom w:val="single" w:sz="4" w:space="0" w:color="000000"/>
-              <w:right w:val="single" w:sz="4" w:space="0" w:color="000000"/>
-            </w:tcBorders>
+            <w:tcW w:w="1139" w:type="dxa"/>
             <w:vAlign w:val="center"/>
           </w:tcPr>
           <w:p>
             <w:pPr>
-              <w:pStyle w:val="23"/>
-              <w:spacing w:before="0" w:line="240" w:lineRule="auto"/>
               <w:jc w:val="center"/>
               <w:rPr>
-                <w:rFonts w:ascii="Times New Roman" w:eastAsia="Calibri" w:hAnsi="Times New Roman" w:cs="Times New Roman"/>
-                <w:sz w:val="22"/>
-                <w:szCs w:val="22"/>
-                <w:lang w:eastAsia="en-US"/>
-              </w:rPr>
-            </w:pPr>
-            <w:r>
-              <w:rPr>
-                <w:rFonts w:ascii="Times New Roman" w:eastAsia="Calibri" w:hAnsi="Times New Roman" w:cs="Times New Roman"/>
-                <w:sz w:val="22"/>
-                <w:szCs w:val="22"/>
-                <w:lang w:eastAsia="en-US"/>
+                <w:bCs/>
+                <w:color w:val="000000" w:themeColor="text1"/>
+              </w:rPr>
+            </w:pPr>
+            <w:r>
+              <w:rPr>
+                <w:b/>
+                <w:bCs/>
+                <w:sz w:val="14"/>
               </w:rPr>
               <w:t>Наименование объекта оценки</w:t>
             </w:r>
@@ -420,34 +396,22 @@
         </w:tc>
         <w:tc>
           <w:tcPr>
-            <w:tcW w:w="1482" w:type="dxa"/>
-            <w:vMerge w:val="restart"/>
-            <w:tcBorders>
-              <w:top w:val="single" w:sz="4" w:space="0" w:color="000000"/>
-              <w:left w:val="single" w:sz="4" w:space="0" w:color="000000"/>
-              <w:bottom w:val="single" w:sz="4" w:space="0" w:color="000000"/>
-              <w:right w:val="single" w:sz="4" w:space="0" w:color="000000"/>
-            </w:tcBorders>
+            <w:tcW w:w="726" w:type="dxa"/>
             <w:vAlign w:val="center"/>
           </w:tcPr>
           <w:p>
             <w:pPr>
-              <w:pStyle w:val="23"/>
-              <w:spacing w:before="0" w:line="240" w:lineRule="auto"/>
               <w:jc w:val="center"/>
               <w:rPr>
-                <w:rFonts w:ascii="Times New Roman" w:eastAsia="Calibri" w:hAnsi="Times New Roman" w:cs="Times New Roman"/>
-                <w:sz w:val="22"/>
-                <w:szCs w:val="22"/>
-                <w:lang w:eastAsia="en-US"/>
-              </w:rPr>
-            </w:pPr>
-            <w:r>
-              <w:rPr>
-                <w:rFonts w:ascii="Times New Roman" w:eastAsia="Calibri" w:hAnsi="Times New Roman" w:cs="Times New Roman"/>
-                <w:sz w:val="22"/>
-                <w:szCs w:val="22"/>
-                <w:lang w:eastAsia="en-US"/>
+                <w:bCs/>
+                <w:color w:val="000000" w:themeColor="text1"/>
+              </w:rPr>
+            </w:pPr>
+            <w:r>
+              <w:rPr>
+                <w:b/>
+                <w:bCs/>
+                <w:sz w:val="14"/>
               </w:rPr>
               <w:t>Фото объекта оценки</w:t>
             </w:r>
@@ -455,564 +419,185 @@
         </w:tc>
         <w:tc>
           <w:tcPr>
-            <w:tcW w:w="2268" w:type="dxa"/>
-            <w:gridSpan w:val="2"/>
-            <w:tcBorders>
-              <w:top w:val="single" w:sz="4" w:space="0" w:color="000000"/>
-              <w:left w:val="single" w:sz="4" w:space="0" w:color="000000"/>
-              <w:bottom w:val="single" w:sz="4" w:space="0" w:color="000000"/>
-              <w:right w:val="single" w:sz="4" w:space="0" w:color="000000"/>
-            </w:tcBorders>
+            <w:tcW w:w="1185" w:type="dxa"/>
             <w:vAlign w:val="center"/>
           </w:tcPr>
           <w:p>
             <w:pPr>
-              <w:pStyle w:val="23"/>
-              <w:spacing w:before="0" w:line="240" w:lineRule="auto"/>
               <w:jc w:val="center"/>
               <w:rPr>
-                <w:rFonts w:ascii="Times New Roman" w:eastAsia="Calibri" w:hAnsi="Times New Roman" w:cs="Times New Roman"/>
-                <w:sz w:val="22"/>
-                <w:szCs w:val="22"/>
-                <w:lang w:eastAsia="en-US"/>
-              </w:rPr>
-            </w:pPr>
-            <w:r>
-              <w:rPr>
-                <w:rFonts w:ascii="Times New Roman" w:eastAsia="Calibri" w:hAnsi="Times New Roman" w:cs="Times New Roman"/>
-                <w:sz w:val="22"/>
-                <w:szCs w:val="22"/>
-                <w:lang w:eastAsia="en-US"/>
+                <w:bCs/>
+                <w:color w:val="000000" w:themeColor="text1"/>
+              </w:rPr>
+            </w:pPr>
+            <w:r>
+              <w:rPr>
+                <w:b/>
+                <w:bCs/>
+                <w:sz w:val="14"/>
               </w:rPr>
               <w:t>Характеристика объекта оценки</w:t>
+            </w:r>
+            <w:r>
+              <w:rPr>
+                <w:b/>
+                <w:bCs/>
+                <w:sz w:val="14"/>
+              </w:rPr>
+              <w:br/>
+              <w:t>Материал</w:t>
             </w:r>
           </w:p>
         </w:tc>
         <w:tc>
           <w:tcPr>
-            <w:tcW w:w="2512" w:type="dxa"/>
-            <w:gridSpan w:val="2"/>
-            <w:tcBorders>
-              <w:top w:val="single" w:sz="4" w:space="0" w:color="000000"/>
-              <w:left w:val="single" w:sz="4" w:space="0" w:color="000000"/>
-              <w:bottom w:val="single" w:sz="4" w:space="0" w:color="000000"/>
-              <w:right w:val="single" w:sz="4" w:space="0" w:color="000000"/>
-            </w:tcBorders>
+            <w:tcW w:w="1185" w:type="dxa"/>
             <w:vAlign w:val="center"/>
           </w:tcPr>
           <w:p>
             <w:pPr>
-              <w:pStyle w:val="23"/>
-              <w:spacing w:before="0" w:line="240" w:lineRule="auto"/>
               <w:jc w:val="center"/>
               <w:rPr>
-                <w:rFonts w:ascii="Times New Roman" w:eastAsia="Calibri" w:hAnsi="Times New Roman" w:cs="Times New Roman"/>
-                <w:sz w:val="22"/>
-                <w:szCs w:val="22"/>
-                <w:lang w:eastAsia="en-US"/>
-              </w:rPr>
-            </w:pPr>
-            <w:r>
-              <w:rPr>
-                <w:rFonts w:ascii="Times New Roman" w:eastAsia="Calibri" w:hAnsi="Times New Roman" w:cs="Times New Roman"/>
-                <w:sz w:val="22"/>
-                <w:szCs w:val="22"/>
-                <w:lang w:eastAsia="en-US"/>
-              </w:rPr>
-              <w:t>Ориентировочная стоимость объекта оценки</w:t>
+                <w:bCs/>
+                <w:color w:val="000000" w:themeColor="text1"/>
+              </w:rPr>
+            </w:pPr>
+            <w:r>
+              <w:rPr>
+                <w:b/>
+                <w:bCs/>
+                <w:sz w:val="14"/>
+              </w:rPr>
+              <w:t>Характеристика объекта оценки</w:t>
+            </w:r>
+            <w:r>
+              <w:rPr>
+                <w:b/>
+                <w:bCs/>
+                <w:sz w:val="14"/>
+              </w:rPr>
+              <w:br/>
+              <w:t>Вес (грамм) Размер (мм)</w:t>
             </w:r>
           </w:p>
         </w:tc>
         <w:tc>
           <w:tcPr>
-            <w:tcW w:w="1256" w:type="dxa"/>
-            <w:tcBorders>
-              <w:top w:val="single" w:sz="4" w:space="0" w:color="000000"/>
-              <w:left w:val="single" w:sz="4" w:space="0" w:color="000000"/>
-              <w:bottom w:val="single" w:sz="4" w:space="0" w:color="000000"/>
-              <w:right w:val="single" w:sz="4" w:space="0" w:color="000000"/>
-            </w:tcBorders>
+            <w:tcW w:w="1322" w:type="dxa"/>
             <w:vAlign w:val="center"/>
           </w:tcPr>
           <w:p>
             <w:pPr>
-              <w:pStyle w:val="23"/>
-              <w:spacing w:before="0" w:line="240" w:lineRule="auto"/>
               <w:jc w:val="center"/>
               <w:rPr>
-                <w:rFonts w:ascii="Times New Roman" w:eastAsia="Calibri" w:hAnsi="Times New Roman" w:cs="Times New Roman"/>
-                <w:sz w:val="18"/>
-                <w:szCs w:val="18"/>
-                <w:lang w:eastAsia="en-US"/>
-              </w:rPr>
-            </w:pPr>
-            <w:r>
-              <w:rPr>
-                <w:rFonts w:ascii="Times New Roman" w:eastAsia="Calibri" w:hAnsi="Times New Roman" w:cs="Times New Roman"/>
-                <w:sz w:val="18"/>
-                <w:szCs w:val="18"/>
-                <w:lang w:eastAsia="en-US"/>
-              </w:rPr>
-              <w:t>Антикварная ценность</w:t>
-            </w:r>
-          </w:p>
-          <w:p>
-            <w:pPr>
-              <w:pStyle w:val="23"/>
-              <w:spacing w:before="0" w:line="240" w:lineRule="auto"/>
-              <w:jc w:val="center"/>
-              <w:rPr>
-                <w:rFonts w:ascii="Times New Roman" w:eastAsia="Calibri" w:hAnsi="Times New Roman" w:cs="Times New Roman"/>
-                <w:sz w:val="18"/>
-                <w:szCs w:val="18"/>
-                <w:lang w:eastAsia="en-US"/>
-              </w:rPr>
-            </w:pPr>
-            <w:r>
-              <w:rPr>
-                <w:rFonts w:ascii="Times New Roman" w:eastAsia="Calibri" w:hAnsi="Times New Roman" w:cs="Times New Roman"/>
-                <w:sz w:val="18"/>
-                <w:szCs w:val="18"/>
-                <w:lang w:eastAsia="en-US"/>
-              </w:rPr>
-              <w:t>(да\нет)</w:t>
+                <w:bCs/>
+                <w:color w:val="000000" w:themeColor="text1"/>
+              </w:rPr>
+            </w:pPr>
+            <w:r>
+              <w:rPr>
+                <w:b/>
+                <w:bCs/>
+                <w:sz w:val="14"/>
+              </w:rPr>
+              <w:t>Ориентировочная стоимость объекта оценки</w:t>
+            </w:r>
+            <w:r>
+              <w:rPr>
+                <w:b/>
+                <w:bCs/>
+                <w:sz w:val="14"/>
+              </w:rPr>
+              <w:br/>
+              <w:t>По оценке Заказчика (руб.)</w:t>
             </w:r>
           </w:p>
         </w:tc>
         <w:tc>
           <w:tcPr>
-            <w:tcW w:w="1240" w:type="dxa"/>
-            <w:tcBorders>
-              <w:top w:val="single" w:sz="4" w:space="0" w:color="000000"/>
-              <w:left w:val="single" w:sz="4" w:space="0" w:color="000000"/>
-              <w:bottom w:val="single" w:sz="4" w:space="0" w:color="000000"/>
-              <w:right w:val="single" w:sz="4" w:space="0" w:color="000000"/>
-            </w:tcBorders>
+            <w:tcW w:w="1322" w:type="dxa"/>
             <w:vAlign w:val="center"/>
           </w:tcPr>
           <w:p>
             <w:pPr>
-              <w:pStyle w:val="23"/>
-              <w:spacing w:before="0" w:line="240" w:lineRule="auto"/>
               <w:jc w:val="center"/>
               <w:rPr>
-                <w:rFonts w:ascii="Times New Roman" w:eastAsia="Calibri" w:hAnsi="Times New Roman" w:cs="Times New Roman"/>
-                <w:sz w:val="20"/>
-                <w:szCs w:val="20"/>
-                <w:lang w:eastAsia="en-US"/>
-              </w:rPr>
-            </w:pPr>
-            <w:r>
-              <w:rPr>
-                <w:rFonts w:ascii="Times New Roman" w:eastAsia="Calibri" w:hAnsi="Times New Roman" w:cs="Times New Roman"/>
-                <w:sz w:val="20"/>
-                <w:szCs w:val="20"/>
-                <w:lang w:eastAsia="en-US"/>
-              </w:rPr>
-              <w:t>Примечание</w:t>
-            </w:r>
-          </w:p>
-        </w:tc>
-      </w:tr>
-      <w:tr>
-        <w:tc>
-          <w:tcPr>
-            <w:tcW w:w="886" w:type="dxa"/>
-            <w:vMerge/>
-            <w:tcBorders>
-              <w:top w:val="single" w:sz="4" w:space="0" w:color="000000"/>
-              <w:left w:val="single" w:sz="4" w:space="0" w:color="000000"/>
-              <w:bottom w:val="single" w:sz="4" w:space="0" w:color="000000"/>
-              <w:right w:val="single" w:sz="4" w:space="0" w:color="000000"/>
-            </w:tcBorders>
-            <w:vAlign w:val="center"/>
-          </w:tcPr>
-          <w:p/>
+                <w:bCs/>
+                <w:color w:val="000000" w:themeColor="text1"/>
+              </w:rPr>
+            </w:pPr>
+            <w:r>
+              <w:rPr>
+                <w:b/>
+                <w:bCs/>
+                <w:sz w:val="14"/>
+              </w:rPr>
+              <w:t>Ориентировочная стоимость объекта оценки</w:t>
+            </w:r>
+            <w:r>
+              <w:rPr>
+                <w:b/>
+                <w:bCs/>
+                <w:sz w:val="14"/>
+              </w:rPr>
+              <w:br/>
+              <w:t>По оценке Исполнителя (руб.)</w:t>
+            </w:r>
+          </w:p>
         </w:tc>
         <w:tc>
           <w:tcPr>
-            <w:tcW w:w="1772" w:type="dxa"/>
-            <w:vMerge/>
-            <w:tcBorders>
-              <w:top w:val="single" w:sz="4" w:space="0" w:color="000000"/>
-              <w:left w:val="single" w:sz="4" w:space="0" w:color="000000"/>
-              <w:bottom w:val="single" w:sz="4" w:space="0" w:color="000000"/>
-              <w:right w:val="single" w:sz="4" w:space="0" w:color="000000"/>
-            </w:tcBorders>
+            <w:tcW w:w="1015" w:type="dxa"/>
             <w:vAlign w:val="center"/>
           </w:tcPr>
-          <w:p/>
+          <w:p>
+            <w:pPr>
+              <w:jc w:val="center"/>
+              <w:rPr>
+                <w:bCs/>
+                <w:color w:val="000000" w:themeColor="text1"/>
+              </w:rPr>
+            </w:pPr>
+            <w:r>
+              <w:rPr>
+                <w:b/>
+                <w:bCs/>
+                <w:sz w:val="14"/>
+              </w:rPr>
+              <w:t>Антикварная ценность</w:t>
+            </w:r>
+            <w:r>
+              <w:rPr>
+                <w:b/>
+                <w:bCs/>
+                <w:sz w:val="14"/>
+              </w:rPr>
+              <w:br/>
+              <w:t>(да/нет)</w:t>
+            </w:r>
+          </w:p>
         </w:tc>
         <w:tc>
           <w:tcPr>
-            <w:tcW w:w="1482" w:type="dxa"/>
-            <w:vMerge/>
-            <w:tcBorders>
-              <w:top w:val="single" w:sz="4" w:space="0" w:color="000000"/>
-              <w:left w:val="single" w:sz="4" w:space="0" w:color="000000"/>
-              <w:bottom w:val="single" w:sz="4" w:space="0" w:color="000000"/>
-              <w:right w:val="single" w:sz="4" w:space="0" w:color="000000"/>
-            </w:tcBorders>
+            <w:tcW w:w="998" w:type="dxa"/>
             <w:vAlign w:val="center"/>
           </w:tcPr>
-          <w:p/>
-        </w:tc>
-        <w:tc>
-          <w:tcPr>
-            <w:tcW w:w="1012" w:type="dxa"/>
-            <w:tcBorders>
-              <w:top w:val="single" w:sz="4" w:space="0" w:color="000000"/>
-              <w:left w:val="single" w:sz="4" w:space="0" w:color="000000"/>
-              <w:bottom w:val="single" w:sz="4" w:space="0" w:color="000000"/>
-              <w:right w:val="single" w:sz="4" w:space="0" w:color="000000"/>
-            </w:tcBorders>
-            <w:vAlign w:val="center"/>
-          </w:tcPr>
-          <w:p>
-            <w:pPr>
-              <w:pStyle w:val="23"/>
-              <w:spacing w:before="0" w:line="240" w:lineRule="auto"/>
+          <w:p>
+            <w:pPr>
               <w:jc w:val="center"/>
               <w:rPr>
-                <w:rFonts w:ascii="Times New Roman" w:eastAsia="Calibri" w:hAnsi="Times New Roman" w:cs="Times New Roman"/>
-                <w:sz w:val="16"/>
-                <w:szCs w:val="16"/>
-                <w:lang w:eastAsia="en-US"/>
-              </w:rPr>
-            </w:pPr>
-            <w:r>
-              <w:rPr>
-                <w:rFonts w:ascii="Times New Roman" w:eastAsia="Calibri" w:hAnsi="Times New Roman" w:cs="Times New Roman"/>
-                <w:sz w:val="16"/>
-                <w:szCs w:val="16"/>
-                <w:lang w:eastAsia="en-US"/>
-              </w:rPr>
-              <w:t>Материал</w:t>
-            </w:r>
-          </w:p>
-        </w:tc>
-        <w:tc>
-          <w:tcPr>
-            <w:tcW w:w="1256" w:type="dxa"/>
-            <w:tcBorders>
-              <w:top w:val="single" w:sz="4" w:space="0" w:color="000000"/>
-              <w:left w:val="single" w:sz="4" w:space="0" w:color="000000"/>
-              <w:bottom w:val="single" w:sz="4" w:space="0" w:color="000000"/>
-              <w:right w:val="single" w:sz="4" w:space="0" w:color="000000"/>
-            </w:tcBorders>
-            <w:vAlign w:val="center"/>
-          </w:tcPr>
-          <w:p>
-            <w:pPr>
-              <w:pStyle w:val="23"/>
-              <w:spacing w:before="0" w:line="240" w:lineRule="auto"/>
-              <w:jc w:val="center"/>
-              <w:rPr>
-                <w:rFonts w:ascii="Times New Roman" w:eastAsia="Calibri" w:hAnsi="Times New Roman" w:cs="Times New Roman"/>
-                <w:sz w:val="20"/>
-                <w:szCs w:val="20"/>
-                <w:lang w:eastAsia="en-US"/>
-              </w:rPr>
-            </w:pPr>
-            <w:r>
-              <w:rPr>
-                <w:rFonts w:ascii="Times New Roman" w:eastAsia="Calibri" w:hAnsi="Times New Roman" w:cs="Times New Roman"/>
-                <w:sz w:val="20"/>
-                <w:szCs w:val="20"/>
-                <w:lang w:eastAsia="en-US"/>
-              </w:rPr>
-              <w:t>Вес</w:t>
-            </w:r>
-          </w:p>
-          <w:p>
-            <w:pPr>
-              <w:pStyle w:val="23"/>
-              <w:spacing w:before="0" w:line="240" w:lineRule="auto"/>
-              <w:jc w:val="center"/>
-              <w:rPr>
-                <w:rFonts w:ascii="Times New Roman" w:eastAsia="Calibri" w:hAnsi="Times New Roman" w:cs="Times New Roman"/>
-                <w:sz w:val="20"/>
-                <w:szCs w:val="20"/>
-                <w:lang w:eastAsia="en-US"/>
-              </w:rPr>
-            </w:pPr>
-            <w:r>
-              <w:rPr>
-                <w:rFonts w:ascii="Times New Roman" w:eastAsia="Calibri" w:hAnsi="Times New Roman" w:cs="Times New Roman"/>
-                <w:sz w:val="20"/>
-                <w:szCs w:val="20"/>
-                <w:lang w:eastAsia="en-US"/>
-              </w:rPr>
-              <w:t>(грамм)</w:t>
-            </w:r>
-          </w:p>
-          <w:p>
-            <w:pPr>
-              <w:pStyle w:val="23"/>
-              <w:spacing w:before="0" w:line="240" w:lineRule="auto"/>
-              <w:jc w:val="center"/>
-              <w:rPr>
-                <w:rFonts w:ascii="Times New Roman" w:eastAsia="Calibri" w:hAnsi="Times New Roman" w:cs="Times New Roman"/>
-                <w:sz w:val="20"/>
-                <w:szCs w:val="20"/>
-                <w:lang w:eastAsia="en-US"/>
-              </w:rPr>
-            </w:pPr>
-            <w:r>
-              <w:rPr>
-                <w:rFonts w:ascii="Times New Roman" w:eastAsia="Calibri" w:hAnsi="Times New Roman" w:cs="Times New Roman"/>
-                <w:sz w:val="20"/>
-                <w:szCs w:val="20"/>
-                <w:lang w:eastAsia="en-US"/>
-              </w:rPr>
-              <w:t>Размер</w:t>
-            </w:r>
-          </w:p>
-          <w:p>
-            <w:pPr>
-              <w:pStyle w:val="23"/>
-              <w:spacing w:before="0" w:line="240" w:lineRule="auto"/>
-              <w:jc w:val="center"/>
-              <w:rPr>
-                <w:rFonts w:ascii="Times New Roman" w:eastAsia="Calibri" w:hAnsi="Times New Roman" w:cs="Times New Roman"/>
-                <w:sz w:val="20"/>
-                <w:szCs w:val="20"/>
-                <w:lang w:eastAsia="en-US"/>
-              </w:rPr>
-            </w:pPr>
-            <w:r>
-              <w:rPr>
-                <w:rFonts w:ascii="Times New Roman" w:eastAsia="Calibri" w:hAnsi="Times New Roman" w:cs="Times New Roman"/>
-                <w:sz w:val="20"/>
-                <w:szCs w:val="20"/>
-                <w:lang w:eastAsia="en-US"/>
-              </w:rPr>
-              <w:t>(мм)</w:t>
-            </w:r>
-          </w:p>
-        </w:tc>
-        <w:tc>
-          <w:tcPr>
-            <w:tcW w:w="1256" w:type="dxa"/>
-            <w:tcBorders>
-              <w:top w:val="single" w:sz="4" w:space="0" w:color="000000"/>
-              <w:left w:val="single" w:sz="4" w:space="0" w:color="000000"/>
-              <w:bottom w:val="single" w:sz="4" w:space="0" w:color="000000"/>
-              <w:right w:val="single" w:sz="4" w:space="0" w:color="000000"/>
-            </w:tcBorders>
-            <w:vAlign w:val="center"/>
-          </w:tcPr>
-          <w:p>
-            <w:pPr>
-              <w:pStyle w:val="23"/>
-              <w:spacing w:before="0" w:line="240" w:lineRule="auto"/>
-              <w:jc w:val="center"/>
-              <w:rPr>
-                <w:rFonts w:ascii="Times New Roman" w:eastAsia="Calibri" w:hAnsi="Times New Roman" w:cs="Times New Roman"/>
-                <w:sz w:val="18"/>
-                <w:szCs w:val="18"/>
-                <w:lang w:eastAsia="en-US"/>
-              </w:rPr>
-            </w:pPr>
-            <w:r>
-              <w:rPr>
-                <w:rFonts w:ascii="Times New Roman" w:eastAsia="Calibri" w:hAnsi="Times New Roman" w:cs="Times New Roman"/>
-                <w:sz w:val="18"/>
-                <w:szCs w:val="18"/>
-                <w:lang w:eastAsia="en-US"/>
-              </w:rPr>
-              <w:t>По оценке Заказчика</w:t>
-            </w:r>
-          </w:p>
-          <w:p>
-            <w:pPr>
-              <w:pStyle w:val="23"/>
-              <w:spacing w:before="0" w:line="240" w:lineRule="auto"/>
-              <w:jc w:val="center"/>
-              <w:rPr>
-                <w:rFonts w:ascii="Times New Roman" w:eastAsia="Calibri" w:hAnsi="Times New Roman" w:cs="Times New Roman"/>
-                <w:sz w:val="18"/>
-                <w:szCs w:val="18"/>
-                <w:lang w:eastAsia="en-US"/>
-              </w:rPr>
-            </w:pPr>
-            <w:r>
-              <w:rPr>
-                <w:rFonts w:ascii="Times New Roman" w:eastAsia="Calibri" w:hAnsi="Times New Roman" w:cs="Times New Roman"/>
-                <w:sz w:val="18"/>
-                <w:szCs w:val="18"/>
-                <w:lang w:eastAsia="en-US"/>
-              </w:rPr>
-              <w:t>(</w:t>
-            </w:r>
-            <w:proofErr w:type="spellStart"/>
-            <w:r>
-              <w:rPr>
-                <w:rFonts w:ascii="Times New Roman" w:eastAsia="Calibri" w:hAnsi="Times New Roman" w:cs="Times New Roman"/>
-                <w:sz w:val="18"/>
-                <w:szCs w:val="18"/>
-                <w:lang w:eastAsia="en-US"/>
-              </w:rPr>
-              <w:t>руб</w:t>
-            </w:r>
-            <w:proofErr w:type="spellEnd"/>
-            <w:r>
-              <w:rPr>
-                <w:rFonts w:ascii="Times New Roman" w:eastAsia="Calibri" w:hAnsi="Times New Roman" w:cs="Times New Roman"/>
-                <w:sz w:val="18"/>
-                <w:szCs w:val="18"/>
-                <w:lang w:eastAsia="en-US"/>
-              </w:rPr>
-              <w:t>)</w:t>
-            </w:r>
-          </w:p>
-        </w:tc>
-        <w:tc>
-          <w:tcPr>
-            <w:tcW w:w="1256" w:type="dxa"/>
-            <w:tcBorders>
-              <w:top w:val="single" w:sz="4" w:space="0" w:color="000000"/>
-              <w:left w:val="single" w:sz="4" w:space="0" w:color="000000"/>
-              <w:bottom w:val="single" w:sz="4" w:space="0" w:color="000000"/>
-              <w:right w:val="single" w:sz="4" w:space="0" w:color="000000"/>
-            </w:tcBorders>
-            <w:vAlign w:val="center"/>
-          </w:tcPr>
-          <w:p>
-            <w:pPr>
-              <w:pStyle w:val="23"/>
-              <w:spacing w:before="0" w:line="240" w:lineRule="auto"/>
-              <w:jc w:val="center"/>
-              <w:rPr>
-                <w:rFonts w:ascii="Times New Roman" w:eastAsia="Calibri" w:hAnsi="Times New Roman" w:cs="Times New Roman"/>
-                <w:sz w:val="18"/>
-                <w:szCs w:val="18"/>
-                <w:lang w:eastAsia="en-US"/>
-              </w:rPr>
-            </w:pPr>
-            <w:r>
-              <w:rPr>
-                <w:rFonts w:ascii="Times New Roman" w:eastAsia="Calibri" w:hAnsi="Times New Roman" w:cs="Times New Roman"/>
-                <w:sz w:val="18"/>
-                <w:szCs w:val="18"/>
-                <w:lang w:eastAsia="en-US"/>
-              </w:rPr>
-              <w:t>По оценке</w:t>
-            </w:r>
-          </w:p>
-          <w:p>
-            <w:pPr>
-              <w:pStyle w:val="23"/>
-              <w:spacing w:before="0" w:line="240" w:lineRule="auto"/>
-              <w:jc w:val="center"/>
-              <w:rPr>
-                <w:rFonts w:ascii="Times New Roman" w:eastAsia="Calibri" w:hAnsi="Times New Roman" w:cs="Times New Roman"/>
-                <w:sz w:val="18"/>
-                <w:szCs w:val="18"/>
-                <w:lang w:eastAsia="en-US"/>
-              </w:rPr>
-            </w:pPr>
-            <w:r>
-              <w:rPr>
-                <w:rFonts w:ascii="Times New Roman" w:eastAsia="Calibri" w:hAnsi="Times New Roman" w:cs="Times New Roman"/>
-                <w:sz w:val="18"/>
-                <w:szCs w:val="18"/>
-                <w:lang w:eastAsia="en-US"/>
-              </w:rPr>
-              <w:t>Исполнителя</w:t>
-            </w:r>
-          </w:p>
-          <w:p>
-            <w:pPr>
-              <w:pStyle w:val="23"/>
-              <w:spacing w:before="0" w:line="240" w:lineRule="auto"/>
-              <w:jc w:val="center"/>
-              <w:rPr>
-                <w:rFonts w:ascii="Times New Roman" w:eastAsia="Calibri" w:hAnsi="Times New Roman" w:cs="Times New Roman"/>
-                <w:sz w:val="18"/>
-                <w:szCs w:val="18"/>
-                <w:lang w:eastAsia="en-US"/>
-              </w:rPr>
-            </w:pPr>
-            <w:r>
-              <w:rPr>
-                <w:rFonts w:ascii="Times New Roman" w:eastAsia="Calibri" w:hAnsi="Times New Roman" w:cs="Times New Roman"/>
-                <w:sz w:val="18"/>
-                <w:szCs w:val="18"/>
-                <w:lang w:eastAsia="en-US"/>
-              </w:rPr>
-              <w:t>(</w:t>
-            </w:r>
-            <w:proofErr w:type="spellStart"/>
-            <w:r>
-              <w:rPr>
-                <w:rFonts w:ascii="Times New Roman" w:eastAsia="Calibri" w:hAnsi="Times New Roman" w:cs="Times New Roman"/>
-                <w:sz w:val="18"/>
-                <w:szCs w:val="18"/>
-                <w:lang w:eastAsia="en-US"/>
-              </w:rPr>
-              <w:t>руб</w:t>
-            </w:r>
-            <w:proofErr w:type="spellEnd"/>
-            <w:r>
-              <w:rPr>
-                <w:rFonts w:ascii="Times New Roman" w:eastAsia="Calibri" w:hAnsi="Times New Roman" w:cs="Times New Roman"/>
-                <w:sz w:val="18"/>
-                <w:szCs w:val="18"/>
-                <w:lang w:eastAsia="en-US"/>
-              </w:rPr>
-              <w:t>)</w:t>
-            </w:r>
-          </w:p>
-        </w:tc>
-        <w:tc>
-          <w:tcPr>
-            <w:tcW w:w="1256" w:type="dxa"/>
-            <w:tcBorders>
-              <w:top w:val="single" w:sz="4" w:space="0" w:color="000000"/>
-              <w:left w:val="single" w:sz="4" w:space="0" w:color="000000"/>
-              <w:bottom w:val="single" w:sz="4" w:space="0" w:color="000000"/>
-              <w:right w:val="single" w:sz="4" w:space="0" w:color="000000"/>
-            </w:tcBorders>
-            <w:vAlign w:val="center"/>
-          </w:tcPr>
-          <w:p>
-            <w:pPr>
-              <w:pStyle w:val="23"/>
-              <w:spacing w:before="0" w:line="240" w:lineRule="auto"/>
-              <w:jc w:val="center"/>
-              <w:rPr>
-                <w:rFonts w:ascii="Times New Roman" w:eastAsia="Calibri" w:hAnsi="Times New Roman" w:cs="Times New Roman"/>
-                <w:sz w:val="22"/>
-                <w:szCs w:val="22"/>
-                <w:lang w:eastAsia="en-US"/>
-              </w:rPr>
-            </w:pPr>
-          </w:p>
-        </w:tc>
-        <w:tc>
-          <w:tcPr>
-            <w:tcW w:w="1240" w:type="dxa"/>
-            <w:tcBorders>
-              <w:top w:val="single" w:sz="4" w:space="0" w:color="000000"/>
-              <w:left w:val="single" w:sz="4" w:space="0" w:color="000000"/>
-              <w:bottom w:val="single" w:sz="4" w:space="0" w:color="000000"/>
-              <w:right w:val="single" w:sz="4" w:space="0" w:color="000000"/>
-            </w:tcBorders>
-            <w:vAlign w:val="center"/>
-          </w:tcPr>
-          <w:p>
-            <w:pPr>
-              <w:pStyle w:val="23"/>
-              <w:spacing w:before="0" w:line="240" w:lineRule="auto"/>
-              <w:jc w:val="center"/>
-              <w:rPr>
-                <w:rFonts w:ascii="Times New Roman" w:eastAsia="Calibri" w:hAnsi="Times New Roman" w:cs="Times New Roman"/>
-                <w:sz w:val="22"/>
-                <w:szCs w:val="22"/>
-                <w:lang w:eastAsia="en-US"/>
-              </w:rPr>
-            </w:pPr>
+                <w:bCs/>
+                <w:color w:val="000000" w:themeColor="text1"/>
+              </w:rPr>
+            </w:pPr>
+            <w:r>
+              <w:rPr>
+                <w:b/>
+                <w:bCs/>
+                <w:sz w:val="14"/>
+              </w:rPr>
+              <w:t>Примечание</w:t>
+            </w:r>
           </w:p>
         </w:tc>
       </w:tr>
@@ -2743,7 +2328,7 @@
     <w:lsdException w:name="Table Web 2" w:semiHidden="1" w:unhideWhenUsed="1"/>
     <w:lsdException w:name="Table Web 3" w:semiHidden="1" w:unhideWhenUsed="1"/>
     <w:lsdException w:name="Balloon Text" w:semiHidden="1" w:unhideWhenUsed="1"/>
-    <w:lsdException w:name="Table Grid" w:uiPriority="39"/>
+    <w:lsdException w:name="Table Grid" w:uiPriority="59"/>
     <w:lsdException w:name="Table Theme" w:semiHidden="1" w:unhideWhenUsed="1"/>
     <w:lsdException w:name="Placeholder Text" w:semiHidden="1"/>
     <w:lsdException w:name="No Spacing" w:uiPriority="0" w:qFormat="1"/>
@@ -3701,6 +3286,27 @@
       <w:lang w:eastAsia="en-US"/>
       <w14:ligatures w14:val="standardContextual"/>
     </w:rPr>
+  </w:style>
+  <w:style w:type="table" w:styleId="af0">
+    <w:name w:val="Table Grid"/>
+    <w:basedOn w:val="a1"/>
+    <w:uiPriority w:val="59"/>
+    <w:rsid w:val="00F7511B"/>
+    <w:rPr>
+      <w:rFonts w:ascii="Times New Roman" w:hAnsi="Times New Roman" w:cs="Times New Roman"/>
+      <w:kern w:val="0"/>
+      <w14:ligatures w14:val="none"/>
+    </w:rPr>
+    <w:tblPr>
+      <w:tblBorders>
+        <w:top w:val="single" w:sz="4" w:space="0" w:color="auto"/>
+        <w:left w:val="single" w:sz="4" w:space="0" w:color="auto"/>
+        <w:bottom w:val="single" w:sz="4" w:space="0" w:color="auto"/>
+        <w:right w:val="single" w:sz="4" w:space="0" w:color="auto"/>
+        <w:insideH w:val="single" w:sz="4" w:space="0" w:color="auto"/>
+        <w:insideV w:val="single" w:sz="4" w:space="0" w:color="auto"/>
+      </w:tblBorders>
+    </w:tblPr>
   </w:style>
 </w:styles>
 </file>

</xml_diff>